<commit_message>
Step 5 → AuthModule（注册/登录/bcrypt/JWT）
</commit_message>
<xml_diff>
--- a/项目实时进展与log.docx
+++ b/项目实时进展与log.docx
@@ -559,7 +559,6 @@
           <w:lang w:val="en-US" w:eastAsia="zh-CN"/>
         </w:rPr>
       </w:pPr>
-      <w:bookmarkStart w:id="0" w:name="_GoBack"/>
       <w:r>
         <w:drawing>
           <wp:inline distT="0" distB="0" distL="114300" distR="114300">
@@ -603,13 +602,50 @@
           </wp:inline>
         </w:drawing>
       </w:r>
+      <w:bookmarkStart w:id="0" w:name="_GoBack"/>
       <w:bookmarkEnd w:id="0"/>
       <w:r>
-        <w:rPr>
-          <w:rFonts w:hint="eastAsia"/>
-          <w:lang w:val="en-US" w:eastAsia="zh-CN"/>
-        </w:rPr>
-        <w:t>+</w:t>
+        <w:drawing>
+          <wp:inline distT="0" distB="0" distL="114300" distR="114300">
+            <wp:extent cx="5105400" cy="2255520"/>
+            <wp:effectExtent l="0" t="0" r="0" b="0"/>
+            <wp:docPr id="13" name="图片 8"/>
+            <wp:cNvGraphicFramePr>
+              <a:graphicFrameLocks xmlns:a="http://schemas.openxmlformats.org/drawingml/2006/main" noChangeAspect="1"/>
+            </wp:cNvGraphicFramePr>
+            <a:graphic xmlns:a="http://schemas.openxmlformats.org/drawingml/2006/main">
+              <a:graphicData uri="http://schemas.openxmlformats.org/drawingml/2006/picture">
+                <pic:pic xmlns:pic="http://schemas.openxmlformats.org/drawingml/2006/picture">
+                  <pic:nvPicPr>
+                    <pic:cNvPr id="13" name="图片 8"/>
+                    <pic:cNvPicPr>
+                      <a:picLocks noChangeAspect="1"/>
+                    </pic:cNvPicPr>
+                  </pic:nvPicPr>
+                  <pic:blipFill>
+                    <a:blip r:embed="rId16"/>
+                    <a:stretch>
+                      <a:fillRect/>
+                    </a:stretch>
+                  </pic:blipFill>
+                  <pic:spPr>
+                    <a:xfrm>
+                      <a:off x="0" y="0"/>
+                      <a:ext cx="5105400" cy="2255520"/>
+                    </a:xfrm>
+                    <a:prstGeom prst="rect">
+                      <a:avLst/>
+                    </a:prstGeom>
+                    <a:noFill/>
+                    <a:ln>
+                      <a:noFill/>
+                    </a:ln>
+                  </pic:spPr>
+                </pic:pic>
+              </a:graphicData>
+            </a:graphic>
+          </wp:inline>
+        </w:drawing>
       </w:r>
     </w:p>
     <w:sectPr>

</xml_diff>